<commit_message>
docs(h10): record R4 postopen evidence and reproduction
</commit_message>
<xml_diff>
--- a/docs/chapters/glava_4_FuzzyXAI_corrected_final.docx
+++ b/docs/chapters/glava_4_FuzzyXAI_corrected_final.docx
@@ -4019,7 +4019,7 @@
         <w:jc w:val="both"/>
       </w:pPr>
       <w:r>
-        <w:t>Такой слой делает экосистему понятной для исследователя и проверяющего: он видит не только финальный запрет или разрешение, но и конкретный путь, по которому входной артефакт прошёл через адаптер, Eₖ, Tᵢⱼ, выбор F, Δ и риск-наблюдатель. При этом машинно-читаемый след остаётся в доказательном пакете и не подменяет пользовательское объяснение.</w:t>
+        <w:t>Такой слой делает маршрут доступным для инспекции исследователем и проверяющим: он видит не только финальный запрет или разрешение, но и конкретный путь, по которому входной артефакт прошёл через адаптер, Eₖ, Tᵢⱼ, выбор F, Δ и риск-наблюдатель. При этом машинно-читаемый след остаётся в доказательном пакете и не подменяет пользовательское объяснение.</w:t>
       </w:r>
     </w:p>
     <w:p>
@@ -4027,7 +4027,45 @@
         <w:pStyle w:val="Heading2"/>
       </w:pPr>
       <w:r>
-        <w:t>4.9. Границы результата главы</w:t>
+        <w:t>4.9. Подтверждающий вычислительный эксперимент H10-C3 R4</w:t>
+      </w:r>
+    </w:p>
+    <w:p>
+      <w:pPr/>
+      <w:r>
+        <w:t>Подтверждающий цикл H10-C3 R4 был выполнен на зашифрованной закрытой совокупности из 240 независимых структурных шаблонов шести семейств конвейеров. Предрасчётное состояние было опубликовано как неизменяемый релиз; закрытая часть открыта один раз после подписанного разрешения владельца протокола. Счётчик открытия был атомарно переведён из 0 в 1 до расшифрования.</w:t>
+      </w:r>
+    </w:p>
+    <w:p>
+      <w:pPr/>
+      <w:r>
+        <w:t>Для H10-C3a преимущество по принадлежности найденного разреза множеству оптимальных решений относительно заранее зафиксированного базового метода typed_without_optimization составило 0,527426 (95%-й иерархический ДИ [0,459916; 0,596639], p Холма = 0,000300). Эффект по снижению нормализованного отклонения стоимости составил 0,244175 (95%-й ДИ [0,210077; 0,278761], p Холма = 0,000300). Положительное направление получено для 6 из 6 семейств конвейеров; H10-C3a получила статус CONFIRMATORY_PASS.</w:t>
+      </w:r>
+    </w:p>
+    <w:p>
+      <w:pPr/>
+      <w:r>
+        <w:t>Для H10-C3b преимущество по доле полной повторной сертификации маршрута относительно заранее зафиксированного weighted_greedy составило 0,333333 (95%-й иерархический ДИ [0,255230; 0,419492], p Холма = 0,000300). Положительное направление также получено для 6 из 6 семейств конвейеров; H10-C3b получила статус CONFIRMATORY_PASS.</w:t>
+      </w:r>
+    </w:p>
+    <w:p>
+      <w:pPr/>
+      <w:r>
+        <w:t>Защитные ограничения выполнены: доля ложной сертификации равна 0,0; доля новых критических нарушений равна 0,0; 95-й процентиль времени расчёта равен 1,047844 мс при зарегистрированной границе 50 мс. Автоматический классификатор присвоил циклу статус SCIENTIFIC_PASS. После раскрытия секрета независимое воспроизведение подтвердило обязательства seed, ciphertext и plaintext, восстановило 240 шаблонов и 1920 строк результатов без расхождений по научным полям, а также воспроизвело статистику и итоговую классификацию.</w:t>
+      </w:r>
+    </w:p>
+    <w:p>
+      <w:pPr/>
+      <w:r>
+        <w:t>Полученный вывод ограничен контролируемой алгоритмической диагностикой объяснительного маршрута, поиском оптимального диагностического разреза и полной повторной сертификацией. В эксперименте не оценивались понятность отчёта для пользователя, экспертная полезность, промышленная или клиническая безопасность, перенос на естественные неизвестные сбои и организационная эффективность.</w:t>
+      </w:r>
+    </w:p>
+    <w:p>
+      <w:pPr>
+        <w:pStyle w:val="Heading2"/>
+      </w:pPr>
+      <w:r>
+        <w:t>4.10. Границы результата главы</w:t>
       </w:r>
     </w:p>
     <w:p>
@@ -4044,7 +4082,7 @@
         <w:pStyle w:val="Heading2"/>
       </w:pPr>
       <w:r>
-        <w:t>4.10. Выводы по главе</w:t>
+        <w:t>4.11. Выводы по главе</w:t>
       </w:r>
     </w:p>
     <w:p>
@@ -4081,6 +4119,14 @@
       </w:pPr>
       <w:r>
         <w:t>Введена структура доказательного пакета, обеспечивающая воспроизводимость маршрута: вход, ExplainPlan, вычисленные поля, диагностические состояния, контрольные суммы, действие и граница вывода.</w:t>
+      </w:r>
+    </w:p>
+    <w:p>
+      <w:pPr>
+        <w:pStyle w:val="ListBullet"/>
+      </w:pPr>
+      <w:r>
+        <w:t>На независимой закрытой совокупности H10-C3 R4 подтверждены преимущества типизированного графового метода по принадлежности диагностического разреза множеству оптимальных решений и по полной повторной сертификации маршрута; итоговый автоматический статус — SCIENTIFIC_PASS при выполненных ограничениях безопасности и времени.</w:t>
       </w:r>
     </w:p>
     <w:p>

</xml_diff>